<commit_message>
commit sua huon dan
</commit_message>
<xml_diff>
--- a/docs/Huong-dan-su-dung-Giao-ly-vien.docx
+++ b/docs/Huong-dan-su-dung-Giao-ly-vien.docx
@@ -90,7 +90,7 @@
           <w:sz w:val="22"/>
           <w:szCs w:val="22"/>
         </w:rPr>
-        <w:t xml:space="preserve">Cập nhật: 14/07/2026</w:t>
+        <w:t xml:space="preserve">Cập nhật: 21/07/2026</w:t>
       </w:r>
     </w:p>
     <w:p>
@@ -339,6 +339,64 @@
           <w:szCs w:val="24"/>
         </w:rPr>
         <w:t xml:space="preserve">Khác với Quản trị xứ / Quản trị giáo lý: GLV không tạo năm học, không tạo lớp, không phân công GLV, không nhập điểm, không quản lý giáo dân.</w:t>
+      </w:r>
+    </w:p>
+    <w:p>
+      <w:pPr>
+        <w:jc w:val="both"/>
+        <w:spacing w:after="120"/>
+      </w:pPr>
+      <w:r>
+        <w:rPr>
+          <w:sz w:val="24"/>
+          <w:szCs w:val="24"/>
+        </w:rPr>
+        <w:t xml:space="preserve">Ngoại lệ — Quyền hỗ trợ quản trị: Quản trị xứ có thể cấp thêm cho một số GLV (thường là Trưởng/Phó) hai quyền mở rộng:</w:t>
+      </w:r>
+    </w:p>
+    <w:p>
+      <w:pPr>
+        <w:spacing w:after="60"/>
+        <w:numPr>
+          <w:ilvl w:val="0"/>
+          <w:numId w:val="4"/>
+        </w:numPr>
+      </w:pPr>
+      <w:r>
+        <w:rPr>
+          <w:sz w:val="24"/>
+          <w:szCs w:val="24"/>
+        </w:rPr>
+        <w:t xml:space="preserve">Quản lý điểm toàn giáo xứ: xem, nhập và sửa điểm mọi lớp trong xứ khi cửa sổ nhập điểm đang mở.</w:t>
+      </w:r>
+    </w:p>
+    <w:p>
+      <w:pPr>
+        <w:spacing w:after="60"/>
+        <w:numPr>
+          <w:ilvl w:val="0"/>
+          <w:numId w:val="4"/>
+        </w:numPr>
+      </w:pPr>
+      <w:r>
+        <w:rPr>
+          <w:sz w:val="24"/>
+          <w:szCs w:val="24"/>
+        </w:rPr>
+        <w:t xml:space="preserve">Sửa thông tin học sinh toàn giáo xứ: cập nhật hồ sơ học sinh toàn xứ (không gồm tạo/xóa học sinh hay liên kết giáo dân).</w:t>
+      </w:r>
+    </w:p>
+    <w:p>
+      <w:pPr>
+        <w:jc w:val="both"/>
+        <w:spacing w:after="120"/>
+      </w:pPr>
+      <w:r>
+        <w:rPr>
+          <w:sz w:val="24"/>
+          <w:szCs w:val="24"/>
+        </w:rPr>
+        <w:t xml:space="preserve">Nếu tài khoản của bạn được cấp các quyền này, một số mục "GLV không làm" bên dưới sẽ trở thành làm được. Mọi thay đổi hồ sơ học sinh đều được hệ thống ghi nhật ký.</w:t>
       </w:r>
     </w:p>
     <w:p>
@@ -353,7 +411,7 @@
           <w:i w:val="1"/>
           <w:iCs w:val="1"/>
         </w:rPr>
-        <w:t xml:space="preserve">Lưu ý: Chỉ thấy dữ liệu của giáo xứ mình. Nếu vừa có vai trò quản trị vừa GLV, giao diện và quyền sẽ theo mức quản trị (sidebar đầy đủ hơn). Tài liệu này dành cho tài khoản GLV thuần.</w:t>
+        <w:t xml:space="preserve">Lưu ý: Chỉ thấy dữ liệu của giáo xứ mình. Nếu vừa có vai trò quản trị vừa GLV, giao diện và quyền sẽ theo mức quản trị (sidebar đầy đủ hơn). Tài liệu này dành cho tài khoản GLV thuần (chưa được cấp quyền hỗ trợ quản trị).</w:t>
       </w:r>
     </w:p>
     <w:p>
@@ -1117,7 +1175,7 @@
           <w:i w:val="1"/>
           <w:iCs w:val="1"/>
         </w:rPr>
-        <w:t xml:space="preserve">Lưu ý: GLV chỉ xem thông tin. Việc thêm, sửa, xóa, import học sinh hoặc in thẻ do Quản trị xứ / Quản trị giáo lý thực hiện. Nếu thấy nút Sửa/Xóa nhưng không lưu được, đó là do quyền hạn chế — hãy nhờ quản trị.</w:t>
+        <w:t xml:space="preserve">Lưu ý: GLV thuần chỉ xem thông tin. Việc thêm, sửa, xóa, import học sinh hoặc in thẻ do Quản trị xứ / Quản trị giáo lý thực hiện. Nếu thấy nút Sửa/Xóa nhưng không lưu được, đó là do quyền hạn chế — hãy nhờ quản trị. Riêng GLV được cấp quyền "Sửa thông tin học sinh toàn giáo xứ" thì được cập nhật hồ sơ học sinh toàn xứ (mỗi lần sửa đều được ghi nhật ký).</w:t>
       </w:r>
     </w:p>
     <w:p>
@@ -1260,7 +1318,7 @@
           <w:sz w:val="24"/>
           <w:szCs w:val="24"/>
         </w:rPr>
-        <w:t xml:space="preserve">Để tránh nhầm lẫn với trang quản trị, GLV không thực hiện các việc sau (nhờ Quản trị xứ / Quản trị giáo lý):</w:t>
+        <w:t xml:space="preserve">Để tránh nhầm lẫn với trang quản trị, GLV thuần không thực hiện các việc sau (nhờ Quản trị xứ / Quản trị giáo lý):</w:t>
       </w:r>
     </w:p>
     <w:p>
@@ -1324,23 +1382,23 @@
           <w:sz w:val="24"/>
           <w:szCs w:val="24"/>
         </w:rPr>
-        <w:t xml:space="preserve">Thêm / sửa / xóa / import học sinh; in thẻ hàng loạt.</w:t>
-      </w:r>
-    </w:p>
-    <w:p>
-      <w:pPr>
-        <w:spacing w:after="60"/>
-        <w:numPr>
-          <w:ilvl w:val="0"/>
-          <w:numId w:val="4"/>
-        </w:numPr>
-      </w:pPr>
-      <w:r>
-        <w:rPr>
-          <w:sz w:val="24"/>
-          <w:szCs w:val="24"/>
-        </w:rPr>
-        <w:t xml:space="preserve">Nhập điểm / xem quản lý kết quả học tập (module điểm số của quản trị).</w:t>
+        <w:t xml:space="preserve">Thêm / xóa / import học sinh; in thẻ hàng loạt. (Sửa hồ sơ học sinh: chỉ GLV được cấp quyền "Sửa thông tin học sinh toàn giáo xứ".)</w:t>
+      </w:r>
+    </w:p>
+    <w:p>
+      <w:pPr>
+        <w:spacing w:after="60"/>
+        <w:numPr>
+          <w:ilvl w:val="0"/>
+          <w:numId w:val="4"/>
+        </w:numPr>
+      </w:pPr>
+      <w:r>
+        <w:rPr>
+          <w:sz w:val="24"/>
+          <w:szCs w:val="24"/>
+        </w:rPr>
+        <w:t xml:space="preserve">Nhập điểm / quản lý kết quả học tập. (Ngoại lệ: GLV được cấp quyền "Quản lý điểm toàn giáo xứ" nhập được điểm mọi lớp khi cửa sổ nhập đang mở.)</w:t>
       </w:r>
     </w:p>
     <w:p>
@@ -1393,6 +1451,21 @@
     </w:p>
     <w:p>
       <w:pPr>
+        <w:spacing w:before="80" w:after="160"/>
+      </w:pPr>
+      <w:r>
+        <w:rPr>
+          <w:color w:val="5B4B00"/>
+          <w:sz w:val="22"/>
+          <w:szCs w:val="22"/>
+          <w:i w:val="1"/>
+          <w:iCs w:val="1"/>
+        </w:rPr>
+        <w:t xml:space="preserve">Lưu ý: Hai quyền mở rộng ở trên do Quản trị xứ cấp riêng cho từng GLV; nếu chưa được cấp thì các việc đó vẫn thuộc quản trị.</w:t>
+      </w:r>
+    </w:p>
+    <w:p>
+      <w:pPr>
         <w:pStyle w:val="Heading1"/>
       </w:pPr>
       <w:bookmarkStart w:id="19" w:name="_Toc19"/>
@@ -1596,7 +1669,7 @@
           <w:sz w:val="24"/>
           <w:szCs w:val="24"/>
         </w:rPr>
-        <w:t xml:space="preserve">Tài khoản GLV thuần không vào được màn nhập điểm. Liên hệ Quản trị giáo lý / Quản trị xứ.</w:t>
+        <w:t xml:space="preserve">Tài khoản GLV thuần không vào được màn nhập điểm. Nếu bạn phụ trách điểm cho cả xứ, nhờ Quản trị xứ cấp quyền "Quản lý điểm toàn giáo xứ" (mục Quyền hỗ trợ quản trị khi sửa GLV); khi đó bạn nhập được điểm mọi lớp lúc cửa sổ nhập đang mở. Nếu không, liên hệ Quản trị giáo lý / Quản trị xứ để nhập giúp.</w:t>
       </w:r>
     </w:p>
     <w:p>
@@ -1642,7 +1715,7 @@
           <w:sz w:val="24"/>
           <w:szCs w:val="24"/>
         </w:rPr>
-        <w:t xml:space="preserve">Đúng với quyền GLV: chỉ xem. Cần chỉnh thông tin thì nhờ quản trị cập nhật hồ sơ.</w:t>
+        <w:t xml:space="preserve">Đúng với GLV thuần: chỉ xem. Nếu bạn cần chỉnh hồ sơ học sinh toàn xứ, nhờ Quản trị xứ cấp quyền "Sửa thông tin học sinh toàn giáo xứ"; khi đó bạn lưu được (mỗi lần sửa được ghi nhật ký). Nếu không, nhờ quản trị cập nhật giúp.</w:t>
       </w:r>
     </w:p>
     <w:p>
@@ -1815,7 +1888,7 @@
 <file path=word/numbering.xml><?xml version="1.0" encoding="utf-8"?>
 <w:numbering xmlns:ve="http://schemas.openxmlformats.org/markup-compatibility/2006" xmlns:o="urn:schemas-microsoft-com:office:office" xmlns:r="http://schemas.openxmlformats.org/officeDocument/2006/relationships" xmlns:m="http://schemas.openxmlformats.org/officeDocument/2006/math" xmlns:v="urn:schemas-microsoft-com:vml" xmlns:wp="http://schemas.openxmlformats.org/drawingml/2006/wordprocessingDrawing" xmlns:w10="urn:schemas-microsoft-com:office:word" xmlns:w="http://schemas.openxmlformats.org/wordprocessingml/2006/main" xmlns:wne="http://schemas.microsoft.com/office/word/2006/wordml">
   <w:abstractNum w:abstractNumId="4">
-    <w:nsid w:val="D6D77FD0"/>
+    <w:nsid w:val="10F3E8A7"/>
     <w:multiLevelType w:val="hybridMultilevel"/>
     <w:lvl w:ilvl="0">
       <w:start w:val="1"/>

</xml_diff>

<commit_message>
commit sua file huong dan
</commit_message>
<xml_diff>
--- a/docs/Huong-dan-su-dung-Giao-ly-vien.docx
+++ b/docs/Huong-dan-su-dung-Giao-ly-vien.docx
@@ -401,6 +401,67 @@
     </w:p>
     <w:p>
       <w:pPr>
+        <w:jc w:val="both"/>
+        <w:spacing w:after="120"/>
+      </w:pPr>
+      <w:r>
+        <w:rPr>
+          <w:sz w:val="24"/>
+          <w:szCs w:val="24"/>
+        </w:rPr>
+        <w:t xml:space="preserve">Điều kiện bắt buộc — Phân công theo năm học: tài khoản GLV chỉ thao tác được khi đang được phân công vào ít nhất một lớp trong năm học hiện tại:</w:t>
+      </w:r>
+    </w:p>
+    <w:p>
+      <w:pPr>
+        <w:spacing w:after="60"/>
+        <w:numPr>
+          <w:ilvl w:val="0"/>
+          <w:numId w:val="4"/>
+        </w:numPr>
+      </w:pPr>
+      <w:r>
+        <w:rPr>
+          <w:sz w:val="24"/>
+          <w:szCs w:val="24"/>
+        </w:rPr>
+        <w:t xml:space="preserve">Đã được phân công (bất kỳ lớp nào): điểm danh được mọi lớp trong xứ, xem học sinh và điểm theo lớp được phân công.</w:t>
+      </w:r>
+    </w:p>
+    <w:p>
+      <w:pPr>
+        <w:spacing w:after="60"/>
+        <w:numPr>
+          <w:ilvl w:val="0"/>
+          <w:numId w:val="4"/>
+        </w:numPr>
+      </w:pPr>
+      <w:r>
+        <w:rPr>
+          <w:sz w:val="24"/>
+          <w:szCs w:val="24"/>
+        </w:rPr>
+        <w:t xml:space="preserve">Chưa được phân công trong năm hiện tại (kể cả tài khoản chỉ có phân công ở năm học cũ): vẫn đăng nhập được nhưng không thao tác gì — các trang sẽ hiện thông báo "Bạn chưa được phân công lớp trong năm học này".</w:t>
+      </w:r>
+    </w:p>
+    <w:p>
+      <w:pPr>
+        <w:spacing w:after="60"/>
+        <w:numPr>
+          <w:ilvl w:val="0"/>
+          <w:numId w:val="4"/>
+        </w:numPr>
+      </w:pPr>
+      <w:r>
+        <w:rPr>
+          <w:sz w:val="24"/>
+          <w:szCs w:val="24"/>
+        </w:rPr>
+        <w:t xml:space="preserve">Quyền hỗ trợ quản trị (nếu có) cũng chỉ có hiệu lực khi đang được phân công trong năm hiện tại.</w:t>
+      </w:r>
+    </w:p>
+    <w:p>
+      <w:pPr>
         <w:spacing w:before="80" w:after="160"/>
       </w:pPr>
       <w:r>
@@ -841,122 +902,6 @@
     </w:p>
     <w:p>
       <w:pPr>
-        <w:pStyle w:val="Heading2"/>
-      </w:pPr>
-      <w:bookmarkStart w:id="10" w:name="_Toc10"/>
-      <w:r>
-        <w:t>5.2. Chọn lớp và buổi</w:t>
-      </w:r>
-      <w:bookmarkEnd w:id="10"/>
-    </w:p>
-    <w:p>
-      <w:pPr>
-        <w:spacing w:after="60"/>
-        <w:numPr>
-          <w:ilvl w:val="0"/>
-          <w:numId w:val="4"/>
-        </w:numPr>
-      </w:pPr>
-      <w:r>
-        <w:rPr>
-          <w:sz w:val="24"/>
-          <w:szCs w:val="24"/>
-        </w:rPr>
-        <w:t xml:space="preserve">Chọn lớp cần điểm danh. Lớp bạn được phân công thường được chọn sẵn / ưu tiên.</w:t>
-      </w:r>
-    </w:p>
-    <w:p>
-      <w:pPr>
-        <w:spacing w:after="60"/>
-        <w:numPr>
-          <w:ilvl w:val="0"/>
-          <w:numId w:val="4"/>
-        </w:numPr>
-      </w:pPr>
-      <w:r>
-        <w:rPr>
-          <w:sz w:val="24"/>
-          <w:szCs w:val="24"/>
-        </w:rPr>
-        <w:t xml:space="preserve">Chọn loại buổi nếu có (ví dụ đi học / đi lễ — tùy cấu hình xứ).</w:t>
-      </w:r>
-    </w:p>
-    <w:p>
-      <w:pPr>
-        <w:spacing w:after="60"/>
-        <w:numPr>
-          <w:ilvl w:val="0"/>
-          <w:numId w:val="4"/>
-        </w:numPr>
-      </w:pPr>
-      <w:r>
-        <w:rPr>
-          <w:sz w:val="24"/>
-          <w:szCs w:val="24"/>
-        </w:rPr>
-        <w:t xml:space="preserve">Kiểm tra ngày / phiên buổi trong ngày.</w:t>
-      </w:r>
-    </w:p>
-    <w:p>
-      <w:pPr>
-        <w:pStyle w:val="Heading2"/>
-      </w:pPr>
-      <w:bookmarkStart w:id="11" w:name="_Toc11"/>
-      <w:r>
-        <w:t>5.3. Đánh dấu và lưu</w:t>
-      </w:r>
-      <w:bookmarkEnd w:id="11"/>
-    </w:p>
-    <w:p>
-      <w:pPr>
-        <w:spacing w:after="60"/>
-        <w:numPr>
-          <w:ilvl w:val="0"/>
-          <w:numId w:val="4"/>
-        </w:numPr>
-      </w:pPr>
-      <w:r>
-        <w:rPr>
-          <w:sz w:val="24"/>
-          <w:szCs w:val="24"/>
-        </w:rPr>
-        <w:t xml:space="preserve">Đánh dấu trạng thái từng học sinh trên danh sách (có mặt / vắng / muộn… tùy tùy chọn hệ thống).</w:t>
-      </w:r>
-    </w:p>
-    <w:p>
-      <w:pPr>
-        <w:spacing w:after="60"/>
-        <w:numPr>
-          <w:ilvl w:val="0"/>
-          <w:numId w:val="4"/>
-        </w:numPr>
-      </w:pPr>
-      <w:r>
-        <w:rPr>
-          <w:sz w:val="24"/>
-          <w:szCs w:val="24"/>
-        </w:rPr>
-        <w:t xml:space="preserve">Nhấn Lưu để ghi nhận.</w:t>
-      </w:r>
-    </w:p>
-    <w:p>
-      <w:pPr>
-        <w:spacing w:after="60"/>
-        <w:numPr>
-          <w:ilvl w:val="0"/>
-          <w:numId w:val="4"/>
-        </w:numPr>
-      </w:pPr>
-      <w:r>
-        <w:rPr>
-          <w:sz w:val="24"/>
-          <w:szCs w:val="24"/>
-        </w:rPr>
-        <w:t xml:space="preserve">Có thể xuất / xem lại điểm danh nếu chức năng khả dụng trên trang.</w:t>
-      </w:r>
-    </w:p>
-    <w:p>
-      <w:pPr>
         <w:spacing w:before="80" w:after="160"/>
       </w:pPr>
       <w:r>
@@ -967,117 +912,123 @@
           <w:i w:val="1"/>
           <w:iCs w:val="1"/>
         </w:rPr>
-        <w:t xml:space="preserve">Lưu ý: Nên lưu ngay sau khi điểm danh xong, tránh thoát giữa chừng làm mất thao tác chưa lưu.</w:t>
+        <w:t xml:space="preserve">Lưu ý: Nếu trang hiện "Bạn chưa được phân công lớp trong năm học này": bạn chưa có phân công trong năm hiện tại nên chưa điểm danh được — liên hệ Ban quản trị giáo lý để được phân công vào lớp.</w:t>
       </w:r>
     </w:p>
     <w:p>
       <w:pPr>
         <w:pStyle w:val="Heading2"/>
       </w:pPr>
-      <w:bookmarkStart w:id="12" w:name="_Toc12"/>
-      <w:r>
-        <w:t>5.4. Thống kê điểm danh</w:t>
-      </w:r>
-      <w:bookmarkEnd w:id="12"/>
-    </w:p>
-    <w:p>
-      <w:pPr>
-        <w:jc w:val="both"/>
-        <w:spacing w:after="120"/>
-      </w:pPr>
-      <w:r>
-        <w:rPr>
-          <w:sz w:val="24"/>
-          <w:szCs w:val="24"/>
-        </w:rPr>
-        <w:t xml:space="preserve">Từ trang điểm danh có thể mở Thống kê điểm danh để xem tỷ lệ chuyên cần theo thời gian / lớp (trong phạm vi bạn được phép xem).</w:t>
-      </w:r>
-    </w:p>
-    <w:p>
-      <w:pPr>
-        <w:pStyle w:val="Heading1"/>
-      </w:pPr>
-      <w:bookmarkStart w:id="13" w:name="_Toc13"/>
-      <w:r>
-        <w:t>6. Quét QR điểm danh</w:t>
-      </w:r>
-      <w:bookmarkEnd w:id="13"/>
-    </w:p>
-    <w:p>
-      <w:pPr>
-        <w:jc w:val="both"/>
-        <w:spacing w:after="120"/>
-      </w:pPr>
-      <w:r>
-        <w:rPr>
-          <w:sz w:val="24"/>
-          <w:szCs w:val="24"/>
-        </w:rPr>
-        <w:t xml:space="preserve">Dùng khi học sinh có thẻ QR:</w:t>
-      </w:r>
-    </w:p>
-    <w:p>
-      <w:pPr>
-        <w:spacing w:after="60"/>
-        <w:numPr>
-          <w:ilvl w:val="0"/>
-          <w:numId w:val="4"/>
-        </w:numPr>
-      </w:pPr>
-      <w:r>
-        <w:rPr>
-          <w:sz w:val="24"/>
-          <w:szCs w:val="24"/>
-        </w:rPr>
-        <w:t xml:space="preserve">Vào Quét QR (nút giữa thanh điều hướng hoặc lối tắt Trang chủ).</w:t>
-      </w:r>
-    </w:p>
-    <w:p>
-      <w:pPr>
-        <w:spacing w:after="60"/>
-        <w:numPr>
-          <w:ilvl w:val="0"/>
-          <w:numId w:val="4"/>
-        </w:numPr>
-      </w:pPr>
-      <w:r>
-        <w:rPr>
-          <w:sz w:val="24"/>
-          <w:szCs w:val="24"/>
-        </w:rPr>
-        <w:t xml:space="preserve">Cho phép trình duyệt / ứng dụng dùng camera khi được hỏi.</w:t>
-      </w:r>
-    </w:p>
-    <w:p>
-      <w:pPr>
-        <w:spacing w:after="60"/>
-        <w:numPr>
-          <w:ilvl w:val="0"/>
-          <w:numId w:val="4"/>
-        </w:numPr>
-      </w:pPr>
-      <w:r>
-        <w:rPr>
-          <w:sz w:val="24"/>
-          <w:szCs w:val="24"/>
-        </w:rPr>
-        <w:t xml:space="preserve">Hướng camera vào mã QR trên thẻ học sinh.</w:t>
-      </w:r>
-    </w:p>
-    <w:p>
-      <w:pPr>
-        <w:spacing w:after="60"/>
-        <w:numPr>
-          <w:ilvl w:val="0"/>
-          <w:numId w:val="4"/>
-        </w:numPr>
-      </w:pPr>
-      <w:r>
-        <w:rPr>
-          <w:sz w:val="24"/>
-          <w:szCs w:val="24"/>
-        </w:rPr>
-        <w:t xml:space="preserve">Hệ thống ghi nhận điểm danh nếu đã có buổi điểm danh phù hợp trong ngày cho lớp.</w:t>
+      <w:bookmarkStart w:id="10" w:name="_Toc10"/>
+      <w:r>
+        <w:t>5.2. Chọn lớp và buổi</w:t>
+      </w:r>
+      <w:bookmarkEnd w:id="10"/>
+    </w:p>
+    <w:p>
+      <w:pPr>
+        <w:spacing w:after="60"/>
+        <w:numPr>
+          <w:ilvl w:val="0"/>
+          <w:numId w:val="4"/>
+        </w:numPr>
+      </w:pPr>
+      <w:r>
+        <w:rPr>
+          <w:sz w:val="24"/>
+          <w:szCs w:val="24"/>
+        </w:rPr>
+        <w:t xml:space="preserve">Chọn lớp cần điểm danh. Lớp bạn được phân công thường được chọn sẵn / ưu tiên; bạn cũng chọn được các lớp khác trong xứ để điểm danh giúp.</w:t>
+      </w:r>
+    </w:p>
+    <w:p>
+      <w:pPr>
+        <w:spacing w:after="60"/>
+        <w:numPr>
+          <w:ilvl w:val="0"/>
+          <w:numId w:val="4"/>
+        </w:numPr>
+      </w:pPr>
+      <w:r>
+        <w:rPr>
+          <w:sz w:val="24"/>
+          <w:szCs w:val="24"/>
+        </w:rPr>
+        <w:t xml:space="preserve">Chọn loại buổi nếu có (ví dụ đi học / đi lễ — tùy cấu hình xứ).</w:t>
+      </w:r>
+    </w:p>
+    <w:p>
+      <w:pPr>
+        <w:spacing w:after="60"/>
+        <w:numPr>
+          <w:ilvl w:val="0"/>
+          <w:numId w:val="4"/>
+        </w:numPr>
+      </w:pPr>
+      <w:r>
+        <w:rPr>
+          <w:sz w:val="24"/>
+          <w:szCs w:val="24"/>
+        </w:rPr>
+        <w:t xml:space="preserve">Kiểm tra ngày / phiên buổi trong ngày.</w:t>
+      </w:r>
+    </w:p>
+    <w:p>
+      <w:pPr>
+        <w:pStyle w:val="Heading2"/>
+      </w:pPr>
+      <w:bookmarkStart w:id="11" w:name="_Toc11"/>
+      <w:r>
+        <w:t>5.3. Đánh dấu và lưu</w:t>
+      </w:r>
+      <w:bookmarkEnd w:id="11"/>
+    </w:p>
+    <w:p>
+      <w:pPr>
+        <w:spacing w:after="60"/>
+        <w:numPr>
+          <w:ilvl w:val="0"/>
+          <w:numId w:val="4"/>
+        </w:numPr>
+      </w:pPr>
+      <w:r>
+        <w:rPr>
+          <w:sz w:val="24"/>
+          <w:szCs w:val="24"/>
+        </w:rPr>
+        <w:t xml:space="preserve">Đánh dấu trạng thái từng học sinh trên danh sách (có mặt / vắng / muộn… tùy tùy chọn hệ thống).</w:t>
+      </w:r>
+    </w:p>
+    <w:p>
+      <w:pPr>
+        <w:spacing w:after="60"/>
+        <w:numPr>
+          <w:ilvl w:val="0"/>
+          <w:numId w:val="4"/>
+        </w:numPr>
+      </w:pPr>
+      <w:r>
+        <w:rPr>
+          <w:sz w:val="24"/>
+          <w:szCs w:val="24"/>
+        </w:rPr>
+        <w:t xml:space="preserve">Nhấn Lưu để ghi nhận.</w:t>
+      </w:r>
+    </w:p>
+    <w:p>
+      <w:pPr>
+        <w:spacing w:after="60"/>
+        <w:numPr>
+          <w:ilvl w:val="0"/>
+          <w:numId w:val="4"/>
+        </w:numPr>
+      </w:pPr>
+      <w:r>
+        <w:rPr>
+          <w:sz w:val="24"/>
+          <w:szCs w:val="24"/>
+        </w:rPr>
+        <w:t xml:space="preserve">Có thể xuất / xem lại điểm danh nếu chức năng khả dụng trên trang.</w:t>
       </w:r>
     </w:p>
     <w:p>
@@ -1092,75 +1043,117 @@
           <w:i w:val="1"/>
           <w:iCs w:val="1"/>
         </w:rPr>
-        <w:t xml:space="preserve">Lưu ý: Nếu quét không nhận: kiểm tra camera, ánh sáng, thẻ còn hiệu lực, và buổi điểm danh của lớp hôm nay đã được tạo/sẵn sàng chưa. Khi cần, quay lại điểm danh thủ công.</w:t>
+        <w:t xml:space="preserve">Lưu ý: Nên lưu ngay sau khi điểm danh xong, tránh thoát giữa chừng làm mất thao tác chưa lưu.</w:t>
+      </w:r>
+    </w:p>
+    <w:p>
+      <w:pPr>
+        <w:pStyle w:val="Heading2"/>
+      </w:pPr>
+      <w:bookmarkStart w:id="12" w:name="_Toc12"/>
+      <w:r>
+        <w:t>5.4. Thống kê điểm danh</w:t>
+      </w:r>
+      <w:bookmarkEnd w:id="12"/>
+    </w:p>
+    <w:p>
+      <w:pPr>
+        <w:jc w:val="both"/>
+        <w:spacing w:after="120"/>
+      </w:pPr>
+      <w:r>
+        <w:rPr>
+          <w:sz w:val="24"/>
+          <w:szCs w:val="24"/>
+        </w:rPr>
+        <w:t xml:space="preserve">Từ trang điểm danh có thể mở Thống kê điểm danh để xem tỷ lệ chuyên cần theo thời gian / lớp (trong phạm vi bạn được phép xem).</w:t>
       </w:r>
     </w:p>
     <w:p>
       <w:pPr>
         <w:pStyle w:val="Heading1"/>
       </w:pPr>
-      <w:bookmarkStart w:id="14" w:name="_Toc14"/>
-      <w:r>
-        <w:t>7. Danh sách học sinh</w:t>
-      </w:r>
-      <w:bookmarkEnd w:id="14"/>
-    </w:p>
-    <w:p>
-      <w:pPr>
-        <w:jc w:val="both"/>
-        <w:spacing w:after="120"/>
-      </w:pPr>
-      <w:r>
-        <w:rPr>
-          <w:sz w:val="24"/>
-          <w:szCs w:val="24"/>
-        </w:rPr>
-        <w:t xml:space="preserve">Vào Học sinh để xem danh sách dạng thẻ / danh sách:</w:t>
-      </w:r>
-    </w:p>
-    <w:p>
-      <w:pPr>
-        <w:spacing w:after="60"/>
-        <w:numPr>
-          <w:ilvl w:val="0"/>
-          <w:numId w:val="4"/>
-        </w:numPr>
-      </w:pPr>
-      <w:r>
-        <w:rPr>
-          <w:sz w:val="24"/>
-          <w:szCs w:val="24"/>
-        </w:rPr>
-        <w:t xml:space="preserve">Lọc theo lớp khi cần.</w:t>
-      </w:r>
-    </w:p>
-    <w:p>
-      <w:pPr>
-        <w:spacing w:after="60"/>
-        <w:numPr>
-          <w:ilvl w:val="0"/>
-          <w:numId w:val="4"/>
-        </w:numPr>
-      </w:pPr>
-      <w:r>
-        <w:rPr>
-          <w:sz w:val="24"/>
-          <w:szCs w:val="24"/>
-        </w:rPr>
-        <w:t xml:space="preserve">Mở chi tiết học sinh: tên thánh, họ tên, ngày sinh, liên hệ, lớp…</w:t>
-      </w:r>
-    </w:p>
-    <w:p>
-      <w:pPr>
-        <w:jc w:val="both"/>
-        <w:spacing w:after="120"/>
-      </w:pPr>
-      <w:r>
-        <w:rPr>
-          <w:sz w:val="24"/>
-          <w:szCs w:val="24"/>
-        </w:rPr>
-        <w:t xml:space="preserve">Mục đích chính: gọi tên, liên hệ phụ huynh, kiểm tra đúng lớp trước / trong / sau buổi học.</w:t>
+      <w:bookmarkStart w:id="13" w:name="_Toc13"/>
+      <w:r>
+        <w:t>6. Quét QR điểm danh</w:t>
+      </w:r>
+      <w:bookmarkEnd w:id="13"/>
+    </w:p>
+    <w:p>
+      <w:pPr>
+        <w:jc w:val="both"/>
+        <w:spacing w:after="120"/>
+      </w:pPr>
+      <w:r>
+        <w:rPr>
+          <w:sz w:val="24"/>
+          <w:szCs w:val="24"/>
+        </w:rPr>
+        <w:t xml:space="preserve">Dùng khi học sinh có thẻ QR:</w:t>
+      </w:r>
+    </w:p>
+    <w:p>
+      <w:pPr>
+        <w:spacing w:after="60"/>
+        <w:numPr>
+          <w:ilvl w:val="0"/>
+          <w:numId w:val="4"/>
+        </w:numPr>
+      </w:pPr>
+      <w:r>
+        <w:rPr>
+          <w:sz w:val="24"/>
+          <w:szCs w:val="24"/>
+        </w:rPr>
+        <w:t xml:space="preserve">Vào Quét QR (nút giữa thanh điều hướng hoặc lối tắt Trang chủ).</w:t>
+      </w:r>
+    </w:p>
+    <w:p>
+      <w:pPr>
+        <w:spacing w:after="60"/>
+        <w:numPr>
+          <w:ilvl w:val="0"/>
+          <w:numId w:val="4"/>
+        </w:numPr>
+      </w:pPr>
+      <w:r>
+        <w:rPr>
+          <w:sz w:val="24"/>
+          <w:szCs w:val="24"/>
+        </w:rPr>
+        <w:t xml:space="preserve">Cho phép trình duyệt / ứng dụng dùng camera khi được hỏi.</w:t>
+      </w:r>
+    </w:p>
+    <w:p>
+      <w:pPr>
+        <w:spacing w:after="60"/>
+        <w:numPr>
+          <w:ilvl w:val="0"/>
+          <w:numId w:val="4"/>
+        </w:numPr>
+      </w:pPr>
+      <w:r>
+        <w:rPr>
+          <w:sz w:val="24"/>
+          <w:szCs w:val="24"/>
+        </w:rPr>
+        <w:t xml:space="preserve">Hướng camera vào mã QR trên thẻ học sinh.</w:t>
+      </w:r>
+    </w:p>
+    <w:p>
+      <w:pPr>
+        <w:spacing w:after="60"/>
+        <w:numPr>
+          <w:ilvl w:val="0"/>
+          <w:numId w:val="4"/>
+        </w:numPr>
+      </w:pPr>
+      <w:r>
+        <w:rPr>
+          <w:sz w:val="24"/>
+          <w:szCs w:val="24"/>
+        </w:rPr>
+        <w:t xml:space="preserve">Hệ thống ghi nhận điểm danh nếu đã có buổi điểm danh phù hợp trong ngày cho lớp.</w:t>
       </w:r>
     </w:p>
     <w:p>
@@ -1175,278 +1168,75 @@
           <w:i w:val="1"/>
           <w:iCs w:val="1"/>
         </w:rPr>
-        <w:t xml:space="preserve">Lưu ý: GLV thuần chỉ xem thông tin. Việc thêm, sửa, xóa, import học sinh hoặc in thẻ do Quản trị xứ / Quản trị giáo lý thực hiện. Nếu thấy nút Sửa/Xóa nhưng không lưu được, đó là do quyền hạn chế — hãy nhờ quản trị. Riêng GLV được cấp quyền "Sửa thông tin học sinh toàn giáo xứ" thì được cập nhật hồ sơ học sinh toàn xứ (mỗi lần sửa đều được ghi nhật ký).</w:t>
+        <w:t xml:space="preserve">Lưu ý: Nếu quét không nhận: kiểm tra camera, ánh sáng, thẻ còn hiệu lực, và buổi điểm danh của lớp hôm nay đã được tạo/sẵn sàng chưa. Khi cần, quay lại điểm danh thủ công. Nếu máy báo "Bạn chưa được phân công lớp trong năm học này" thì cần được phân công lớp trước khi quét.</w:t>
       </w:r>
     </w:p>
     <w:p>
       <w:pPr>
         <w:pStyle w:val="Heading1"/>
       </w:pPr>
-      <w:bookmarkStart w:id="15" w:name="_Toc15"/>
-      <w:r>
-        <w:t>8. Tài khoản và thông báo</w:t>
-      </w:r>
-      <w:bookmarkEnd w:id="15"/>
-    </w:p>
-    <w:p>
-      <w:pPr>
-        <w:pStyle w:val="Heading2"/>
-      </w:pPr>
-      <w:bookmarkStart w:id="16" w:name="_Toc16"/>
-      <w:r>
-        <w:t>8.1. Tài khoản</w:t>
-      </w:r>
-      <w:bookmarkEnd w:id="16"/>
-    </w:p>
-    <w:p>
-      <w:pPr>
-        <w:jc w:val="both"/>
-        <w:spacing w:after="120"/>
-      </w:pPr>
-      <w:r>
-        <w:rPr>
-          <w:sz w:val="24"/>
-          <w:szCs w:val="24"/>
-        </w:rPr>
-        <w:t xml:space="preserve">Trong Tài khoản bạn có thể:</w:t>
-      </w:r>
-    </w:p>
-    <w:p>
-      <w:pPr>
-        <w:spacing w:after="60"/>
-        <w:numPr>
-          <w:ilvl w:val="0"/>
-          <w:numId w:val="4"/>
-        </w:numPr>
-      </w:pPr>
-      <w:r>
-        <w:rPr>
-          <w:sz w:val="24"/>
-          <w:szCs w:val="24"/>
-        </w:rPr>
-        <w:t xml:space="preserve">Cập nhật họ tên hiển thị.</w:t>
-      </w:r>
-    </w:p>
-    <w:p>
-      <w:pPr>
-        <w:spacing w:after="60"/>
-        <w:numPr>
-          <w:ilvl w:val="0"/>
-          <w:numId w:val="4"/>
-        </w:numPr>
-      </w:pPr>
-      <w:r>
-        <w:rPr>
-          <w:sz w:val="24"/>
-          <w:szCs w:val="24"/>
-        </w:rPr>
-        <w:t xml:space="preserve">Cập nhật email đăng nhập (nếu dùng).</w:t>
-      </w:r>
-    </w:p>
-    <w:p>
-      <w:pPr>
-        <w:spacing w:after="60"/>
-        <w:numPr>
-          <w:ilvl w:val="0"/>
-          <w:numId w:val="4"/>
-        </w:numPr>
-      </w:pPr>
-      <w:r>
-        <w:rPr>
-          <w:sz w:val="24"/>
-          <w:szCs w:val="24"/>
-        </w:rPr>
-        <w:t xml:space="preserve">Đổi ảnh đại diện (nếu có).</w:t>
-      </w:r>
-    </w:p>
-    <w:p>
-      <w:pPr>
-        <w:spacing w:after="60"/>
-        <w:numPr>
-          <w:ilvl w:val="0"/>
-          <w:numId w:val="4"/>
-        </w:numPr>
-      </w:pPr>
-      <w:r>
-        <w:rPr>
-          <w:sz w:val="24"/>
-          <w:szCs w:val="24"/>
-        </w:rPr>
-        <w:t xml:space="preserve">Đổi mật khẩu.</w:t>
-      </w:r>
-    </w:p>
-    <w:p>
-      <w:pPr>
-        <w:pStyle w:val="Heading2"/>
-      </w:pPr>
-      <w:bookmarkStart w:id="17" w:name="_Toc17"/>
-      <w:r>
-        <w:t>8.2. Thông báo</w:t>
-      </w:r>
-      <w:bookmarkEnd w:id="17"/>
-    </w:p>
-    <w:p>
-      <w:pPr>
-        <w:jc w:val="both"/>
-        <w:spacing w:after="120"/>
-      </w:pPr>
-      <w:r>
-        <w:rPr>
-          <w:sz w:val="24"/>
-          <w:szCs w:val="24"/>
-        </w:rPr>
-        <w:t xml:space="preserve">Chuông thông báo / mục Thông báo dùng để xem các thông tin hệ thống gửi tới (ví dụ tóm tắt liên quan điểm danh, tùy cấu hình). Nên kiểm tra định kỳ.</w:t>
-      </w:r>
-    </w:p>
-    <w:p>
-      <w:pPr>
-        <w:pStyle w:val="Heading1"/>
-      </w:pPr>
-      <w:bookmarkStart w:id="18" w:name="_Toc18"/>
-      <w:r>
-        <w:t>9. Những việc GLV không làm trên hệ thống</w:t>
-      </w:r>
-      <w:bookmarkEnd w:id="18"/>
-    </w:p>
-    <w:p>
-      <w:pPr>
-        <w:jc w:val="both"/>
-        <w:spacing w:after="120"/>
-      </w:pPr>
-      <w:r>
-        <w:rPr>
-          <w:sz w:val="24"/>
-          <w:szCs w:val="24"/>
-        </w:rPr>
-        <w:t xml:space="preserve">Để tránh nhầm lẫn với trang quản trị, GLV thuần không thực hiện các việc sau (nhờ Quản trị xứ / Quản trị giáo lý):</w:t>
-      </w:r>
-    </w:p>
-    <w:p>
-      <w:pPr>
-        <w:spacing w:after="60"/>
-        <w:numPr>
-          <w:ilvl w:val="0"/>
-          <w:numId w:val="4"/>
-        </w:numPr>
-      </w:pPr>
-      <w:r>
-        <w:rPr>
-          <w:sz w:val="24"/>
-          <w:szCs w:val="24"/>
-        </w:rPr>
-        <w:t xml:space="preserve">Tạo / sửa / kích hoạt năm học.</w:t>
-      </w:r>
-    </w:p>
-    <w:p>
-      <w:pPr>
-        <w:spacing w:after="60"/>
-        <w:numPr>
-          <w:ilvl w:val="0"/>
-          <w:numId w:val="4"/>
-        </w:numPr>
-      </w:pPr>
-      <w:r>
-        <w:rPr>
-          <w:sz w:val="24"/>
-          <w:szCs w:val="24"/>
-        </w:rPr>
-        <w:t xml:space="preserve">Tạo lớp, xếp lớp hàng loạt, phân công GLV.</w:t>
-      </w:r>
-    </w:p>
-    <w:p>
-      <w:pPr>
-        <w:spacing w:after="60"/>
-        <w:numPr>
-          <w:ilvl w:val="0"/>
-          <w:numId w:val="4"/>
-        </w:numPr>
-      </w:pPr>
-      <w:r>
-        <w:rPr>
-          <w:sz w:val="24"/>
-          <w:szCs w:val="24"/>
-        </w:rPr>
-        <w:t xml:space="preserve">Tạo tài khoản GLV khác, import danh sách GLV.</w:t>
-      </w:r>
-    </w:p>
-    <w:p>
-      <w:pPr>
-        <w:spacing w:after="60"/>
-        <w:numPr>
-          <w:ilvl w:val="0"/>
-          <w:numId w:val="4"/>
-        </w:numPr>
-      </w:pPr>
-      <w:r>
-        <w:rPr>
-          <w:sz w:val="24"/>
-          <w:szCs w:val="24"/>
-        </w:rPr>
-        <w:t xml:space="preserve">Thêm / xóa / import học sinh; in thẻ hàng loạt. (Sửa hồ sơ học sinh: chỉ GLV được cấp quyền "Sửa thông tin học sinh toàn giáo xứ".)</w:t>
-      </w:r>
-    </w:p>
-    <w:p>
-      <w:pPr>
-        <w:spacing w:after="60"/>
-        <w:numPr>
-          <w:ilvl w:val="0"/>
-          <w:numId w:val="4"/>
-        </w:numPr>
-      </w:pPr>
-      <w:r>
-        <w:rPr>
-          <w:sz w:val="24"/>
-          <w:szCs w:val="24"/>
-        </w:rPr>
-        <w:t xml:space="preserve">Nhập điểm / quản lý kết quả học tập. (Ngoại lệ: GLV được cấp quyền "Quản lý điểm toàn giáo xứ" nhập được điểm mọi lớp khi cửa sổ nhập đang mở.)</w:t>
-      </w:r>
-    </w:p>
-    <w:p>
-      <w:pPr>
-        <w:spacing w:after="60"/>
-        <w:numPr>
-          <w:ilvl w:val="0"/>
-          <w:numId w:val="4"/>
-        </w:numPr>
-      </w:pPr>
-      <w:r>
-        <w:rPr>
-          <w:sz w:val="24"/>
-          <w:szCs w:val="24"/>
-        </w:rPr>
-        <w:t xml:space="preserve">Quản lý cấu hình phiên điểm danh nâng cao của toàn xứ (nếu chỉ hiện trên trang quản trị).</w:t>
-      </w:r>
-    </w:p>
-    <w:p>
-      <w:pPr>
-        <w:spacing w:after="60"/>
-        <w:numPr>
-          <w:ilvl w:val="0"/>
-          <w:numId w:val="4"/>
-        </w:numPr>
-      </w:pPr>
-      <w:r>
-        <w:rPr>
-          <w:sz w:val="24"/>
-          <w:szCs w:val="24"/>
-        </w:rPr>
-        <w:t xml:space="preserve">Quản lý giáo dân, gia đình, giáo họ, hội đoàn.</w:t>
-      </w:r>
-    </w:p>
-    <w:p>
-      <w:pPr>
-        <w:spacing w:after="60"/>
-        <w:numPr>
-          <w:ilvl w:val="0"/>
-          <w:numId w:val="4"/>
-        </w:numPr>
-      </w:pPr>
-      <w:r>
-        <w:rPr>
-          <w:sz w:val="24"/>
-          <w:szCs w:val="24"/>
-        </w:rPr>
-        <w:t xml:space="preserve">Sửa Thông tin giáo xứ.</w:t>
+      <w:bookmarkStart w:id="14" w:name="_Toc14"/>
+      <w:r>
+        <w:t>7. Danh sách học sinh</w:t>
+      </w:r>
+      <w:bookmarkEnd w:id="14"/>
+    </w:p>
+    <w:p>
+      <w:pPr>
+        <w:jc w:val="both"/>
+        <w:spacing w:after="120"/>
+      </w:pPr>
+      <w:r>
+        <w:rPr>
+          <w:sz w:val="24"/>
+          <w:szCs w:val="24"/>
+        </w:rPr>
+        <w:t xml:space="preserve">Vào Học sinh để xem danh sách dạng thẻ / danh sách:</w:t>
+      </w:r>
+    </w:p>
+    <w:p>
+      <w:pPr>
+        <w:spacing w:after="60"/>
+        <w:numPr>
+          <w:ilvl w:val="0"/>
+          <w:numId w:val="4"/>
+        </w:numPr>
+      </w:pPr>
+      <w:r>
+        <w:rPr>
+          <w:sz w:val="24"/>
+          <w:szCs w:val="24"/>
+        </w:rPr>
+        <w:t xml:space="preserve">Lọc theo lớp khi cần.</w:t>
+      </w:r>
+    </w:p>
+    <w:p>
+      <w:pPr>
+        <w:spacing w:after="60"/>
+        <w:numPr>
+          <w:ilvl w:val="0"/>
+          <w:numId w:val="4"/>
+        </w:numPr>
+      </w:pPr>
+      <w:r>
+        <w:rPr>
+          <w:sz w:val="24"/>
+          <w:szCs w:val="24"/>
+        </w:rPr>
+        <w:t xml:space="preserve">Mở chi tiết học sinh: tên thánh, họ tên, ngày sinh, liên hệ, lớp…</w:t>
+      </w:r>
+    </w:p>
+    <w:p>
+      <w:pPr>
+        <w:jc w:val="both"/>
+        <w:spacing w:after="120"/>
+      </w:pPr>
+      <w:r>
+        <w:rPr>
+          <w:sz w:val="24"/>
+          <w:szCs w:val="24"/>
+        </w:rPr>
+        <w:t xml:space="preserve">Mục đích chính: gọi tên, liên hệ phụ huynh, kiểm tra đúng lớp trước / trong / sau buổi học.</w:t>
       </w:r>
     </w:p>
     <w:p>
@@ -1461,6 +1251,292 @@
           <w:i w:val="1"/>
           <w:iCs w:val="1"/>
         </w:rPr>
+        <w:t xml:space="preserve">Lưu ý: GLV thuần chỉ xem thông tin. Việc thêm, sửa, xóa, import học sinh hoặc in thẻ do Quản trị xứ / Quản trị giáo lý thực hiện. Nếu thấy nút Sửa/Xóa nhưng không lưu được, đó là do quyền hạn chế — hãy nhờ quản trị. Riêng GLV được cấp quyền "Sửa thông tin học sinh toàn giáo xứ" thì được cập nhật hồ sơ học sinh toàn xứ (mỗi lần sửa đều được ghi nhật ký).</w:t>
+      </w:r>
+    </w:p>
+    <w:p>
+      <w:pPr>
+        <w:pStyle w:val="Heading1"/>
+      </w:pPr>
+      <w:bookmarkStart w:id="15" w:name="_Toc15"/>
+      <w:r>
+        <w:t>8. Tài khoản và thông báo</w:t>
+      </w:r>
+      <w:bookmarkEnd w:id="15"/>
+    </w:p>
+    <w:p>
+      <w:pPr>
+        <w:pStyle w:val="Heading2"/>
+      </w:pPr>
+      <w:bookmarkStart w:id="16" w:name="_Toc16"/>
+      <w:r>
+        <w:t>8.1. Tài khoản</w:t>
+      </w:r>
+      <w:bookmarkEnd w:id="16"/>
+    </w:p>
+    <w:p>
+      <w:pPr>
+        <w:jc w:val="both"/>
+        <w:spacing w:after="120"/>
+      </w:pPr>
+      <w:r>
+        <w:rPr>
+          <w:sz w:val="24"/>
+          <w:szCs w:val="24"/>
+        </w:rPr>
+        <w:t xml:space="preserve">Trong Tài khoản bạn có thể:</w:t>
+      </w:r>
+    </w:p>
+    <w:p>
+      <w:pPr>
+        <w:spacing w:after="60"/>
+        <w:numPr>
+          <w:ilvl w:val="0"/>
+          <w:numId w:val="4"/>
+        </w:numPr>
+      </w:pPr>
+      <w:r>
+        <w:rPr>
+          <w:sz w:val="24"/>
+          <w:szCs w:val="24"/>
+        </w:rPr>
+        <w:t xml:space="preserve">Cập nhật họ tên hiển thị.</w:t>
+      </w:r>
+    </w:p>
+    <w:p>
+      <w:pPr>
+        <w:spacing w:after="60"/>
+        <w:numPr>
+          <w:ilvl w:val="0"/>
+          <w:numId w:val="4"/>
+        </w:numPr>
+      </w:pPr>
+      <w:r>
+        <w:rPr>
+          <w:sz w:val="24"/>
+          <w:szCs w:val="24"/>
+        </w:rPr>
+        <w:t xml:space="preserve">Cập nhật email đăng nhập (nếu dùng).</w:t>
+      </w:r>
+    </w:p>
+    <w:p>
+      <w:pPr>
+        <w:spacing w:after="60"/>
+        <w:numPr>
+          <w:ilvl w:val="0"/>
+          <w:numId w:val="4"/>
+        </w:numPr>
+      </w:pPr>
+      <w:r>
+        <w:rPr>
+          <w:sz w:val="24"/>
+          <w:szCs w:val="24"/>
+        </w:rPr>
+        <w:t xml:space="preserve">Đổi ảnh đại diện (nếu có).</w:t>
+      </w:r>
+    </w:p>
+    <w:p>
+      <w:pPr>
+        <w:spacing w:after="60"/>
+        <w:numPr>
+          <w:ilvl w:val="0"/>
+          <w:numId w:val="4"/>
+        </w:numPr>
+      </w:pPr>
+      <w:r>
+        <w:rPr>
+          <w:sz w:val="24"/>
+          <w:szCs w:val="24"/>
+        </w:rPr>
+        <w:t xml:space="preserve">Đổi mật khẩu.</w:t>
+      </w:r>
+    </w:p>
+    <w:p>
+      <w:pPr>
+        <w:pStyle w:val="Heading2"/>
+      </w:pPr>
+      <w:bookmarkStart w:id="17" w:name="_Toc17"/>
+      <w:r>
+        <w:t>8.2. Thông báo</w:t>
+      </w:r>
+      <w:bookmarkEnd w:id="17"/>
+    </w:p>
+    <w:p>
+      <w:pPr>
+        <w:jc w:val="both"/>
+        <w:spacing w:after="120"/>
+      </w:pPr>
+      <w:r>
+        <w:rPr>
+          <w:sz w:val="24"/>
+          <w:szCs w:val="24"/>
+        </w:rPr>
+        <w:t xml:space="preserve">Chuông thông báo / mục Thông báo dùng để xem các thông tin hệ thống gửi tới (ví dụ tóm tắt liên quan điểm danh, tùy cấu hình). Nên kiểm tra định kỳ.</w:t>
+      </w:r>
+    </w:p>
+    <w:p>
+      <w:pPr>
+        <w:pStyle w:val="Heading1"/>
+      </w:pPr>
+      <w:bookmarkStart w:id="18" w:name="_Toc18"/>
+      <w:r>
+        <w:t>9. Những việc GLV không làm trên hệ thống</w:t>
+      </w:r>
+      <w:bookmarkEnd w:id="18"/>
+    </w:p>
+    <w:p>
+      <w:pPr>
+        <w:jc w:val="both"/>
+        <w:spacing w:after="120"/>
+      </w:pPr>
+      <w:r>
+        <w:rPr>
+          <w:sz w:val="24"/>
+          <w:szCs w:val="24"/>
+        </w:rPr>
+        <w:t xml:space="preserve">Để tránh nhầm lẫn với trang quản trị, GLV thuần không thực hiện các việc sau (nhờ Quản trị xứ / Quản trị giáo lý):</w:t>
+      </w:r>
+    </w:p>
+    <w:p>
+      <w:pPr>
+        <w:spacing w:after="60"/>
+        <w:numPr>
+          <w:ilvl w:val="0"/>
+          <w:numId w:val="4"/>
+        </w:numPr>
+      </w:pPr>
+      <w:r>
+        <w:rPr>
+          <w:sz w:val="24"/>
+          <w:szCs w:val="24"/>
+        </w:rPr>
+        <w:t xml:space="preserve">Tạo / sửa / kích hoạt năm học.</w:t>
+      </w:r>
+    </w:p>
+    <w:p>
+      <w:pPr>
+        <w:spacing w:after="60"/>
+        <w:numPr>
+          <w:ilvl w:val="0"/>
+          <w:numId w:val="4"/>
+        </w:numPr>
+      </w:pPr>
+      <w:r>
+        <w:rPr>
+          <w:sz w:val="24"/>
+          <w:szCs w:val="24"/>
+        </w:rPr>
+        <w:t xml:space="preserve">Tạo lớp, xếp lớp hàng loạt, phân công GLV.</w:t>
+      </w:r>
+    </w:p>
+    <w:p>
+      <w:pPr>
+        <w:spacing w:after="60"/>
+        <w:numPr>
+          <w:ilvl w:val="0"/>
+          <w:numId w:val="4"/>
+        </w:numPr>
+      </w:pPr>
+      <w:r>
+        <w:rPr>
+          <w:sz w:val="24"/>
+          <w:szCs w:val="24"/>
+        </w:rPr>
+        <w:t xml:space="preserve">Tạo tài khoản GLV khác, import danh sách GLV.</w:t>
+      </w:r>
+    </w:p>
+    <w:p>
+      <w:pPr>
+        <w:spacing w:after="60"/>
+        <w:numPr>
+          <w:ilvl w:val="0"/>
+          <w:numId w:val="4"/>
+        </w:numPr>
+      </w:pPr>
+      <w:r>
+        <w:rPr>
+          <w:sz w:val="24"/>
+          <w:szCs w:val="24"/>
+        </w:rPr>
+        <w:t xml:space="preserve">Thêm / xóa / import học sinh; in thẻ hàng loạt. (Sửa hồ sơ học sinh: chỉ GLV được cấp quyền "Sửa thông tin học sinh toàn giáo xứ".)</w:t>
+      </w:r>
+    </w:p>
+    <w:p>
+      <w:pPr>
+        <w:spacing w:after="60"/>
+        <w:numPr>
+          <w:ilvl w:val="0"/>
+          <w:numId w:val="4"/>
+        </w:numPr>
+      </w:pPr>
+      <w:r>
+        <w:rPr>
+          <w:sz w:val="24"/>
+          <w:szCs w:val="24"/>
+        </w:rPr>
+        <w:t xml:space="preserve">Nhập điểm / quản lý kết quả học tập. (Ngoại lệ: GLV được cấp quyền "Quản lý điểm toàn giáo xứ" nhập được điểm mọi lớp khi cửa sổ nhập đang mở.)</w:t>
+      </w:r>
+    </w:p>
+    <w:p>
+      <w:pPr>
+        <w:spacing w:after="60"/>
+        <w:numPr>
+          <w:ilvl w:val="0"/>
+          <w:numId w:val="4"/>
+        </w:numPr>
+      </w:pPr>
+      <w:r>
+        <w:rPr>
+          <w:sz w:val="24"/>
+          <w:szCs w:val="24"/>
+        </w:rPr>
+        <w:t xml:space="preserve">Quản lý cấu hình phiên điểm danh nâng cao của toàn xứ (nếu chỉ hiện trên trang quản trị).</w:t>
+      </w:r>
+    </w:p>
+    <w:p>
+      <w:pPr>
+        <w:spacing w:after="60"/>
+        <w:numPr>
+          <w:ilvl w:val="0"/>
+          <w:numId w:val="4"/>
+        </w:numPr>
+      </w:pPr>
+      <w:r>
+        <w:rPr>
+          <w:sz w:val="24"/>
+          <w:szCs w:val="24"/>
+        </w:rPr>
+        <w:t xml:space="preserve">Quản lý giáo dân, gia đình, giáo họ, hội đoàn.</w:t>
+      </w:r>
+    </w:p>
+    <w:p>
+      <w:pPr>
+        <w:spacing w:after="60"/>
+        <w:numPr>
+          <w:ilvl w:val="0"/>
+          <w:numId w:val="4"/>
+        </w:numPr>
+      </w:pPr>
+      <w:r>
+        <w:rPr>
+          <w:sz w:val="24"/>
+          <w:szCs w:val="24"/>
+        </w:rPr>
+        <w:t xml:space="preserve">Sửa Thông tin giáo xứ.</w:t>
+      </w:r>
+    </w:p>
+    <w:p>
+      <w:pPr>
+        <w:spacing w:before="80" w:after="160"/>
+      </w:pPr>
+      <w:r>
+        <w:rPr>
+          <w:color w:val="5B4B00"/>
+          <w:sz w:val="22"/>
+          <w:szCs w:val="22"/>
+          <w:i w:val="1"/>
+          <w:iCs w:val="1"/>
+        </w:rPr>
         <w:t xml:space="preserve">Lưu ý: Hai quyền mở rộng ở trên do Quản trị xứ cấp riêng cho từng GLV; nếu chưa được cấp thì các việc đó vẫn thuộc quản trị.</w:t>
       </w:r>
     </w:p>
@@ -1609,7 +1685,7 @@
       </w:pPr>
       <w:bookmarkStart w:id="22" w:name="_Toc22"/>
       <w:r>
-        <w:t>11.2. Không thấy lớp của mình?</w:t>
+        <w:t>11.2. Không thấy lớp của mình / báo "chưa được phân công"?</w:t>
       </w:r>
       <w:bookmarkEnd w:id="22"/>
     </w:p>
@@ -1623,7 +1699,7 @@
           <w:sz w:val="24"/>
           <w:szCs w:val="24"/>
         </w:rPr>
-        <w:t xml:space="preserve">Nhờ quản trị kiểm tra bạn đã được phân công vào lớp thuộc năm học đang hoạt động.</w:t>
+        <w:t xml:space="preserve">Nhờ quản trị kiểm tra bạn đã được phân công vào lớp thuộc năm học đang hoạt động. Nếu tài khoản chỉ có phân công từ năm học cũ, sang năm mới sẽ không thao tác được cho tới khi được phân công lại — đây là ràng buộc an toàn của hệ thống.</w:t>
       </w:r>
     </w:p>
     <w:p>
@@ -1888,7 +1964,7 @@
 <file path=word/numbering.xml><?xml version="1.0" encoding="utf-8"?>
 <w:numbering xmlns:ve="http://schemas.openxmlformats.org/markup-compatibility/2006" xmlns:o="urn:schemas-microsoft-com:office:office" xmlns:r="http://schemas.openxmlformats.org/officeDocument/2006/relationships" xmlns:m="http://schemas.openxmlformats.org/officeDocument/2006/math" xmlns:v="urn:schemas-microsoft-com:vml" xmlns:wp="http://schemas.openxmlformats.org/drawingml/2006/wordprocessingDrawing" xmlns:w10="urn:schemas-microsoft-com:office:word" xmlns:w="http://schemas.openxmlformats.org/wordprocessingml/2006/main" xmlns:wne="http://schemas.microsoft.com/office/word/2006/wordml">
   <w:abstractNum w:abstractNumId="4">
-    <w:nsid w:val="10F3E8A7"/>
+    <w:nsid w:val="A7353BD1"/>
     <w:multiLevelType w:val="hybridMultilevel"/>
     <w:lvl w:ilvl="0">
       <w:start w:val="1"/>

</xml_diff>